<commit_message>
Playlab: tailor the résumé
Built from the CodePath copy: a summary about building with AI and how
people learn, Chiron's bullet leads with the simulations it codes, AI
prototyping heads the Encoura bullets, and the AI skills line comes first.

Co-Authored-By: Claude Opus 5.5 <noreply@anthropic.com>
Claude-Session: https://claude.ai/code/session_01LvZ3gHBdktRdPitHGw6W9i
</commit_message>
<xml_diff>
--- a/playlab/resume.docx
+++ b/playlab/resume.docx
@@ -140,7 +140,7 @@
           <w:iCs w:val="1"/>
           <w:rtl w:val="0"/>
         </w:rPr>
-        <w:t xml:space="preserve">Product designer building usable K-12 discovery and guidance tools, backed by learning science.</w:t>
+        <w:t xml:space="preserve">Ed-tech product designer who builds with AI and designs from how people actually learn.</w:t>
       </w:r>
       <w:r>
         <w:rPr>
@@ -240,7 +240,7 @@
           <w:ilvl w:val="0"/>
           <w:numId w:val="1"/>
         </w:numPr>
-        <w:spacing w:after="200" w:before="200" w:lineRule="auto"/>
+        <w:spacing w:after="200" w:before="100" w:lineRule="auto"/>
         <w:ind w:left="540.0000000000001" w:hanging="359.9999999999999"/>
         <w:rPr>
           <w:rFonts w:ascii="Arial" w:cs="Arial" w:eastAsia="Arial" w:hAnsi="Arial"/>
@@ -255,7 +255,7 @@
           <w:bCs w:val="0"/>
           <w:rtl w:val="0"/>
         </w:rPr>
-        <w:t xml:space="preserve">Built a Claude skill for building micro-courses that gates progression on demonstrated mastery, adapting scaffolding based on Socratic dialogue and misconception tracking.</w:t>
+        <w:t xml:space="preserve">Built a Claude skill that turns any conversation into a micro-course, coding interactive simulations on the fly and gating progression on mastery through Socratic dialogue.</w:t>
       </w:r>
       <w:r>
         <w:rPr>
@@ -323,7 +323,36 @@
           <w:ilvl w:val="0"/>
           <w:numId w:val="1"/>
         </w:numPr>
-        <w:spacing w:after="200" w:before="200" w:line="240" w:lineRule="auto"/>
+        <w:spacing w:after="200" w:before="100" w:line="240" w:lineRule="auto"/>
+        <w:ind w:left="540.0000000000001" w:hanging="359.9999999999999"/>
+        <w:rPr>
+          <w:rFonts w:ascii="Arial" w:cs="Arial" w:eastAsia="Arial" w:hAnsi="Arial"/>
+        </w:rPr>
+      </w:pPr>
+      <w:r>
+        <w:rPr>
+          <w:rFonts w:ascii="Arial" w:cs="Arial" w:eastAsia="Arial" w:hAnsi="Arial"/>
+          <w:b w:val="0"/>
+          <w:bCs w:val="0"/>
+          <w:rtl w:val="0"/>
+        </w:rPr>
+        <w:t xml:space="preserve">Pioneered AI prototyping at Encoura with Figma Make and Claude Code; drive much of the team's product analytics and first connected Pendo to Claude Code over MCP.</w:t>
+      </w:r>
+      <w:r>
+        <w:rPr>
+          <w:rtl w:val="0"/>
+        </w:rPr>
+      </w:r>
+    </w:p>
+    <w:p>
+      <w:pPr>
+        <w:pStyle w:val="Heading3"/>
+        <w:pageBreakBefore w:val="0"/>
+        <w:numPr>
+          <w:ilvl w:val="0"/>
+          <w:numId w:val="1"/>
+        </w:numPr>
+        <w:spacing w:after="200" w:before="100" w:line="240" w:lineRule="auto"/>
         <w:ind w:left="540.0000000000001" w:hanging="359.9999999999999"/>
         <w:rPr>
           <w:rFonts w:ascii="Arial" w:cs="Arial" w:eastAsia="Arial" w:hAnsi="Arial"/>
@@ -338,7 +367,38 @@
           <w:bCs w:val="0"/>
           <w:rtl w:val="0"/>
         </w:rPr>
-        <w:t xml:space="preserve">Redesigned onboarding for a 2x longer intake survey maintaining completion rates using chunking and micro-interactions to cut cognitive load; built Encoura's first in-app A/B test. </w:t>
+        <w:t xml:space="preserve">Rebuilt student onboarding and accounts from classroom research; doubled the intake survey yet held completion near 84% in Encoura's first in-app A/B test.</w:t>
+      </w:r>
+      <w:r>
+        <w:rPr>
+          <w:rtl w:val="0"/>
+        </w:rPr>
+      </w:r>
+    </w:p>
+    <w:p>
+      <w:pPr>
+        <w:pStyle w:val="Heading3"/>
+        <w:numPr>
+          <w:ilvl w:val="0"/>
+          <w:numId w:val="1"/>
+        </w:numPr>
+        <w:spacing w:after="200" w:lineRule="auto"/>
+        <w:ind w:left="540.0000000000001" w:hanging="359.9999999999999"/>
+        <w:rPr>
+          <w:rFonts w:ascii="Arial" w:cs="Arial" w:eastAsia="Arial" w:hAnsi="Arial"/>
+        </w:rPr>
+      </w:pPr>
+      <w:bookmarkStart w:colFirst="0" w:colLast="0" w:name="_heading=h.j0ng1hyib37" w:id="8"/>
+      <w:bookmarkEnd w:id="8"/>
+      <w:r>
+        <w:rPr>
+          <w:rFonts w:ascii="Arial" w:cs="Arial" w:eastAsia="Arial" w:hAnsi="Arial"/>
+          <w:b w:val="0"/>
+          <w:bCs w:val="0"/>
+          <w:highlight w:val="white"/>
+          <w:rtl w:val="0"/>
+        </w:rPr>
+        <w:t xml:space="preserve">Built the counselor workflow side of Encourage for Educators, including student status tracking and roster tools used to manage hundreds of students simultaneously.</w:t>
       </w:r>
       <w:r>
         <w:rPr>
@@ -369,7 +429,7 @@
           <w:bCs w:val="0"/>
           <w:rtl w:val="0"/>
         </w:rPr>
-        <w:t xml:space="preserve">Led migration of Encourage to cross-platform React Native, redesigning layouts to hold up across school-issued devices and WCAG 2.1 AA standards.</w:t>
+        <w:t xml:space="preserve">Own the Encourage Design System; re-architected its governance so engineers and designers compose from consistent components with no case-by-case review.</w:t>
       </w:r>
       <w:r>
         <w:rPr>
@@ -391,17 +451,62 @@
           <w:rFonts w:ascii="Arial" w:cs="Arial" w:eastAsia="Arial" w:hAnsi="Arial"/>
         </w:rPr>
       </w:pPr>
-      <w:bookmarkStart w:colFirst="0" w:colLast="0" w:name="_heading=h.jrnv5zbj20hv" w:id="7"/>
-      <w:bookmarkEnd w:id="7"/>
       <w:r>
         <w:rPr>
           <w:rFonts w:ascii="Arial" w:cs="Arial" w:eastAsia="Arial" w:hAnsi="Arial"/>
           <w:b w:val="0"/>
           <w:bCs w:val="0"/>
-          <w:highlight w:val="white"/>
-          <w:rtl w:val="0"/>
-        </w:rPr>
-        <w:t xml:space="preserve">Owned the Encourage Design System, re-architected governance so engineers and designers compose from consistent components with no case-by-case review.</w:t>
+          <w:rtl w:val="0"/>
+        </w:rPr>
+        <w:t xml:space="preserve">Led the migration of Encourage (150,000+ students) to React Native, redesigning layouts to hold up on school-issued devices and meet WCAG 2.1 AA.</w:t>
+      </w:r>
+      <w:r>
+        <w:rPr>
+          <w:rtl w:val="0"/>
+        </w:rPr>
+      </w:r>
+    </w:p>
+    <w:p>
+      <w:pPr>
+        <w:pStyle w:val="Heading3"/>
+        <w:rPr>
+          <w:rFonts w:ascii="Arial" w:cs="Arial" w:eastAsia="Arial" w:hAnsi="Arial"/>
+          <w:i w:val="1"/>
+          <w:iCs w:val="1"/>
+        </w:rPr>
+      </w:pPr>
+      <w:bookmarkStart w:colFirst="0" w:colLast="0" w:name="_heading=h.5wkar0gi1bq5" w:id="9"/>
+      <w:bookmarkEnd w:id="9"/>
+      <w:r>
+        <w:rPr>
+          <w:rFonts w:ascii="Arial" w:cs="Arial" w:eastAsia="Arial" w:hAnsi="Arial"/>
+          <w:rtl w:val="0"/>
+        </w:rPr>
+        <w:t xml:space="preserve">Rochester Regional Health — </w:t>
+      </w:r>
+      <w:r>
+        <w:rPr>
+          <w:rFonts w:ascii="Arial" w:cs="Arial" w:eastAsia="Arial" w:hAnsi="Arial"/>
+          <w:b w:val="0"/>
+          <w:bCs w:val="0"/>
+          <w:i w:val="1"/>
+          <w:iCs w:val="1"/>
+          <w:rtl w:val="0"/>
+        </w:rPr>
+        <w:t xml:space="preserve">UX/UI Intern  </w:t>
+        <w:tab/>
+        <w:t xml:space="preserve"> </w:t>
+        <w:tab/>
+        <w:tab/>
+        <w:tab/>
+        <w:t xml:space="preserve"> </w:t>
+      </w:r>
+      <w:r>
+        <w:rPr>
+          <w:rFonts w:ascii="Arial" w:cs="Arial" w:eastAsia="Arial" w:hAnsi="Arial"/>
+          <w:rtl w:val="0"/>
+        </w:rPr>
+        <w:t xml:space="preserve">Feb 2020 - Aug 2020</w:t>
       </w:r>
       <w:r>
         <w:rPr>
@@ -416,14 +521,14 @@
           <w:ilvl w:val="0"/>
           <w:numId w:val="1"/>
         </w:numPr>
-        <w:spacing w:after="200" w:lineRule="auto"/>
+        <w:spacing w:after="200" w:before="100" w:lineRule="auto"/>
         <w:ind w:left="540.0000000000001" w:hanging="359.9999999999999"/>
         <w:rPr>
           <w:rFonts w:ascii="Arial" w:cs="Arial" w:eastAsia="Arial" w:hAnsi="Arial"/>
         </w:rPr>
       </w:pPr>
-      <w:bookmarkStart w:colFirst="0" w:colLast="0" w:name="_heading=h.j0ng1hyib37" w:id="8"/>
-      <w:bookmarkEnd w:id="8"/>
+      <w:bookmarkStart w:colFirst="0" w:colLast="0" w:name="_heading=h.e9155ujwlkp5" w:id="10"/>
+      <w:bookmarkEnd w:id="10"/>
       <w:r>
         <w:rPr>
           <w:rFonts w:ascii="Arial" w:cs="Arial" w:eastAsia="Arial" w:hAnsi="Arial"/>
@@ -432,105 +537,8 @@
           <w:highlight w:val="white"/>
           <w:rtl w:val="0"/>
         </w:rPr>
-        <w:t xml:space="preserve">Built the counselor workflow side of Encourage for Educators, including student status tracking and roster tools used to manage hundreds of students simultaneously.</w:t>
-      </w:r>
-      <w:r>
-        <w:rPr>
-          <w:rtl w:val="0"/>
-        </w:rPr>
-      </w:r>
-    </w:p>
-    <w:p>
-      <w:pPr>
-        <w:pStyle w:val="Heading3"/>
-        <w:rPr>
-          <w:rFonts w:ascii="Arial" w:cs="Arial" w:eastAsia="Arial" w:hAnsi="Arial"/>
-          <w:i w:val="1"/>
-          <w:iCs w:val="1"/>
-        </w:rPr>
-      </w:pPr>
-      <w:bookmarkStart w:colFirst="0" w:colLast="0" w:name="_heading=h.5wkar0gi1bq5" w:id="9"/>
-      <w:bookmarkEnd w:id="9"/>
-      <w:r>
-        <w:rPr>
-          <w:rFonts w:ascii="Arial" w:cs="Arial" w:eastAsia="Arial" w:hAnsi="Arial"/>
-          <w:rtl w:val="0"/>
-        </w:rPr>
-        <w:t xml:space="preserve">Rochester Regional Health — </w:t>
-      </w:r>
-      <w:r>
-        <w:rPr>
-          <w:rFonts w:ascii="Arial" w:cs="Arial" w:eastAsia="Arial" w:hAnsi="Arial"/>
-          <w:b w:val="0"/>
-          <w:bCs w:val="0"/>
-          <w:i w:val="1"/>
-          <w:iCs w:val="1"/>
-          <w:rtl w:val="0"/>
-        </w:rPr>
-        <w:t xml:space="preserve">UX/UI Intern  </w:t>
-        <w:tab/>
-        <w:t xml:space="preserve"> </w:t>
-        <w:tab/>
-        <w:tab/>
-        <w:tab/>
-        <w:t xml:space="preserve"> </w:t>
-      </w:r>
-      <w:r>
-        <w:rPr>
-          <w:rFonts w:ascii="Arial" w:cs="Arial" w:eastAsia="Arial" w:hAnsi="Arial"/>
-          <w:rtl w:val="0"/>
-        </w:rPr>
-        <w:t xml:space="preserve">Feb 2020 - Aug 2020</w:t>
-      </w:r>
-      <w:r>
-        <w:rPr>
-          <w:rtl w:val="0"/>
-        </w:rPr>
-      </w:r>
-    </w:p>
-    <w:p>
-      <w:pPr>
-        <w:pStyle w:val="Heading3"/>
-        <w:numPr>
-          <w:ilvl w:val="0"/>
-          <w:numId w:val="1"/>
-        </w:numPr>
-        <w:spacing w:before="200" w:lineRule="auto"/>
-        <w:ind w:left="540.0000000000001" w:hanging="359.9999999999999"/>
-        <w:rPr>
-          <w:rFonts w:ascii="Arial" w:cs="Arial" w:eastAsia="Arial" w:hAnsi="Arial"/>
-        </w:rPr>
-      </w:pPr>
-      <w:bookmarkStart w:colFirst="0" w:colLast="0" w:name="_heading=h.e9155ujwlkp5" w:id="10"/>
-      <w:bookmarkEnd w:id="10"/>
-      <w:r>
-        <w:rPr>
-          <w:rFonts w:ascii="Arial" w:cs="Arial" w:eastAsia="Arial" w:hAnsi="Arial"/>
-          <w:b w:val="0"/>
-          <w:bCs w:val="0"/>
-          <w:highlight w:val="white"/>
-          <w:rtl w:val="0"/>
-        </w:rPr>
         <w:t xml:space="preserve">Designed a contact tracing system for Rochester Institute of Technology to monitor the spread of COVID-19 for over 18,000 students and staff, reducing user workload by half.</w:t>
       </w:r>
-      <w:r>
-        <w:rPr>
-          <w:rtl w:val="0"/>
-        </w:rPr>
-      </w:r>
-    </w:p>
-    <w:p>
-      <w:pPr>
-        <w:pStyle w:val="Heading3"/>
-        <w:ind w:left="0" w:firstLine="0"/>
-        <w:rPr>
-          <w:rFonts w:ascii="Arial" w:cs="Arial" w:eastAsia="Arial" w:hAnsi="Arial"/>
-          <w:b w:val="0"/>
-          <w:bCs w:val="0"/>
-        </w:rPr>
-      </w:pPr>
-      <w:bookmarkStart w:colFirst="0" w:colLast="0" w:name="_heading=h.axn974bmv2ir" w:id="11"/>
-      <w:bookmarkEnd w:id="11"/>
       <w:r>
         <w:rPr>
           <w:rtl w:val="0"/>
@@ -591,7 +599,7 @@
           <w:ilvl w:val="0"/>
           <w:numId w:val="2"/>
         </w:numPr>
-        <w:spacing w:before="200" w:lineRule="auto"/>
+        <w:spacing w:after="100" w:before="100" w:lineRule="auto"/>
         <w:ind w:left="540.0000000000001" w:hanging="359.9999999999999"/>
         <w:rPr>
           <w:rFonts w:ascii="Arial" w:cs="Arial" w:eastAsia="Arial" w:hAnsi="Arial"/>
@@ -609,7 +617,7 @@
           <w:highlight w:val="white"/>
           <w:rtl w:val="0"/>
         </w:rPr>
-        <w:t xml:space="preserve">Conducted usability tests and user interviews with insurance brokers on a Salesforce CRM application to validate user-friendliness and accessibility of new features and updates.​​ </w:t>
+        <w:t xml:space="preserve">Conducted usability tests and user interviews with insurance brokers on a Salesforce CRM application to validate the usability and accessibility of new features.​​ </w:t>
       </w:r>
       <w:r>
         <w:rPr>
@@ -833,7 +841,7 @@
     </w:p>
     <w:p>
       <w:pPr>
-        <w:spacing w:before="200" w:line="240" w:lineRule="auto"/>
+        <w:spacing w:before="90" w:line="240" w:lineRule="auto"/>
         <w:rPr>
           <w:rFonts w:ascii="Arial" w:cs="Arial" w:eastAsia="Arial" w:hAnsi="Arial"/>
           <w:sz w:val="22"/>
@@ -849,21 +857,21 @@
           <w:szCs w:val="22"/>
           <w:rtl w:val="0"/>
         </w:rPr>
-        <w:t xml:space="preserve">UX Design: </w:t>
-      </w:r>
-      <w:r>
-        <w:rPr>
-          <w:rFonts w:ascii="Arial" w:cs="Arial" w:eastAsia="Arial" w:hAnsi="Arial"/>
-          <w:sz w:val="22"/>
-          <w:szCs w:val="22"/>
-          <w:rtl w:val="0"/>
-        </w:rPr>
-        <w:t xml:space="preserve">Information Architecture, Wireframing, Prototyping, Design Systems, UX Writing</w:t>
-      </w:r>
-    </w:p>
-    <w:p>
-      <w:pPr>
-        <w:spacing w:before="200" w:line="240" w:lineRule="auto"/>
+        <w:t xml:space="preserve">AI: </w:t>
+      </w:r>
+      <w:r>
+        <w:rPr>
+          <w:rFonts w:ascii="Arial" w:cs="Arial" w:eastAsia="Arial" w:hAnsi="Arial"/>
+          <w:sz w:val="22"/>
+          <w:szCs w:val="22"/>
+          <w:rtl w:val="0"/>
+        </w:rPr>
+        <w:t xml:space="preserve">Claude Code, Claude Skills, Figma Make, MCP Integrations (Pendo), AI Prototyping</w:t>
+      </w:r>
+    </w:p>
+    <w:p>
+      <w:pPr>
+        <w:spacing w:before="90" w:line="240" w:lineRule="auto"/>
         <w:rPr>
           <w:rFonts w:ascii="Arial" w:cs="Arial" w:eastAsia="Arial" w:hAnsi="Arial"/>
           <w:sz w:val="22"/>
@@ -879,21 +887,21 @@
           <w:szCs w:val="22"/>
           <w:rtl w:val="0"/>
         </w:rPr>
-        <w:t xml:space="preserve">Front-End: </w:t>
-      </w:r>
-      <w:r>
-        <w:rPr>
-          <w:rFonts w:ascii="Arial" w:cs="Arial" w:eastAsia="Arial" w:hAnsi="Arial"/>
-          <w:sz w:val="22"/>
-          <w:szCs w:val="22"/>
-          <w:rtl w:val="0"/>
-        </w:rPr>
-        <w:t xml:space="preserve">HTML, CSS, JavaScript, React Native, AI-Assisted Prototyping (Claude Code)</w:t>
-      </w:r>
-    </w:p>
-    <w:p>
-      <w:pPr>
-        <w:spacing w:before="200" w:line="240" w:lineRule="auto"/>
+        <w:t xml:space="preserve">UX Design: </w:t>
+      </w:r>
+      <w:r>
+        <w:rPr>
+          <w:rFonts w:ascii="Arial" w:cs="Arial" w:eastAsia="Arial" w:hAnsi="Arial"/>
+          <w:sz w:val="22"/>
+          <w:szCs w:val="22"/>
+          <w:rtl w:val="0"/>
+        </w:rPr>
+        <w:t xml:space="preserve">Interaction Design, User Flows, IA, Prototyping, Design Systems</w:t>
+      </w:r>
+    </w:p>
+    <w:p>
+      <w:pPr>
+        <w:spacing w:before="90" w:line="240" w:lineRule="auto"/>
         <w:rPr>
           <w:rFonts w:ascii="Arial" w:cs="Arial" w:eastAsia="Arial" w:hAnsi="Arial"/>
           <w:sz w:val="22"/>
@@ -909,21 +917,21 @@
           <w:szCs w:val="22"/>
           <w:rtl w:val="0"/>
         </w:rPr>
-        <w:t xml:space="preserve">Accessibility: </w:t>
-      </w:r>
-      <w:r>
-        <w:rPr>
-          <w:rFonts w:ascii="Arial" w:cs="Arial" w:eastAsia="Arial" w:hAnsi="Arial"/>
-          <w:sz w:val="22"/>
-          <w:szCs w:val="22"/>
-          <w:rtl w:val="0"/>
-        </w:rPr>
-        <w:t xml:space="preserve">WCAG 2.1 AA, CPACC (in progress), Keyboard &amp; Screen-Reader-Aware Design</w:t>
-      </w:r>
-    </w:p>
-    <w:p>
-      <w:pPr>
-        <w:spacing w:before="200" w:line="240" w:lineRule="auto"/>
+        <w:t xml:space="preserve">Front-End: </w:t>
+      </w:r>
+      <w:r>
+        <w:rPr>
+          <w:rFonts w:ascii="Arial" w:cs="Arial" w:eastAsia="Arial" w:hAnsi="Arial"/>
+          <w:sz w:val="22"/>
+          <w:szCs w:val="22"/>
+          <w:rtl w:val="0"/>
+        </w:rPr>
+        <w:t xml:space="preserve">HTML, CSS, JavaScript, React Native</w:t>
+      </w:r>
+    </w:p>
+    <w:p>
+      <w:pPr>
+        <w:spacing w:before="90" w:line="240" w:lineRule="auto"/>
         <w:rPr>
           <w:rFonts w:ascii="Arial" w:cs="Arial" w:eastAsia="Arial" w:hAnsi="Arial"/>
           <w:sz w:val="22"/>
@@ -939,21 +947,21 @@
           <w:szCs w:val="22"/>
           <w:rtl w:val="0"/>
         </w:rPr>
-        <w:t xml:space="preserve">Learning Design: </w:t>
-      </w:r>
-      <w:r>
-        <w:rPr>
-          <w:rFonts w:ascii="Arial" w:cs="Arial" w:eastAsia="Arial" w:hAnsi="Arial"/>
-          <w:sz w:val="22"/>
-          <w:szCs w:val="22"/>
-          <w:rtl w:val="0"/>
-        </w:rPr>
-        <w:t xml:space="preserve">Self-Paced Instruction, ADDIE, Universal Design for Learning</w:t>
-      </w:r>
-    </w:p>
-    <w:p>
-      <w:pPr>
-        <w:spacing w:before="200" w:line="240" w:lineRule="auto"/>
+        <w:t xml:space="preserve">Accessibility: </w:t>
+      </w:r>
+      <w:r>
+        <w:rPr>
+          <w:rFonts w:ascii="Arial" w:cs="Arial" w:eastAsia="Arial" w:hAnsi="Arial"/>
+          <w:sz w:val="22"/>
+          <w:szCs w:val="22"/>
+          <w:rtl w:val="0"/>
+        </w:rPr>
+        <w:t xml:space="preserve">WCAG 2.1 AA, CPACC (in progress), Keyboard &amp; Screen-Reader-Aware Design</w:t>
+      </w:r>
+    </w:p>
+    <w:p>
+      <w:pPr>
+        <w:spacing w:before="90" w:line="240" w:lineRule="auto"/>
         <w:rPr>
           <w:rFonts w:ascii="Arial" w:cs="Arial" w:eastAsia="Arial" w:hAnsi="Arial"/>
           <w:sz w:val="22"/>
@@ -969,6 +977,36 @@
           <w:szCs w:val="22"/>
           <w:rtl w:val="0"/>
         </w:rPr>
+        <w:t xml:space="preserve">Learning Design: </w:t>
+      </w:r>
+      <w:r>
+        <w:rPr>
+          <w:rFonts w:ascii="Arial" w:cs="Arial" w:eastAsia="Arial" w:hAnsi="Arial"/>
+          <w:sz w:val="22"/>
+          <w:szCs w:val="22"/>
+          <w:rtl w:val="0"/>
+        </w:rPr>
+        <w:t xml:space="preserve">Self-Paced Instruction, ADDIE, Universal Design for Learning</w:t>
+      </w:r>
+    </w:p>
+    <w:p>
+      <w:pPr>
+        <w:spacing w:before="90" w:line="240" w:lineRule="auto"/>
+        <w:rPr>
+          <w:rFonts w:ascii="Arial" w:cs="Arial" w:eastAsia="Arial" w:hAnsi="Arial"/>
+          <w:sz w:val="22"/>
+          <w:szCs w:val="22"/>
+        </w:rPr>
+      </w:pPr>
+      <w:r>
+        <w:rPr>
+          <w:rFonts w:ascii="Arial" w:cs="Arial" w:eastAsia="Arial" w:hAnsi="Arial"/>
+          <w:b w:val="1"/>
+          <w:bCs w:val="1"/>
+          <w:sz w:val="22"/>
+          <w:szCs w:val="22"/>
+          <w:rtl w:val="0"/>
+        </w:rPr>
         <w:t xml:space="preserve">Research: </w:t>
       </w:r>
       <w:r>
@@ -978,12 +1016,12 @@
           <w:szCs w:val="22"/>
           <w:rtl w:val="0"/>
         </w:rPr>
-        <w:t xml:space="preserve">Usability Testing, A/B Testing, User Interviews, Survey Design, Contextual Inquiry</w:t>
-      </w:r>
-    </w:p>
-    <w:p>
-      <w:pPr>
-        <w:spacing w:before="200" w:line="240" w:lineRule="auto"/>
+        <w:t xml:space="preserve">Discovery, Interviews, Contextual Inquiry, A/B &amp; Usability Testing, Analytics</w:t>
+      </w:r>
+    </w:p>
+    <w:p>
+      <w:pPr>
+        <w:spacing w:before="90" w:line="240" w:lineRule="auto"/>
         <w:rPr>
           <w:rFonts w:ascii="Arial" w:cs="Arial" w:eastAsia="Arial" w:hAnsi="Arial"/>
           <w:sz w:val="22"/>

</xml_diff>

<commit_message>
Playlab résumé: plainer Pendo MCP line, data not survey, drop the review claim
Co-Authored-By: Claude Opus 5.5 <noreply@anthropic.com>
Claude-Session: https://claude.ai/code/session_01LvZ3gHBdktRdPitHGw6W9i
</commit_message>
<xml_diff>
--- a/playlab/resume.docx
+++ b/playlab/resume.docx
@@ -336,7 +336,7 @@
           <w:bCs w:val="0"/>
           <w:rtl w:val="0"/>
         </w:rPr>
-        <w:t xml:space="preserve">Pioneered AI prototyping at Encoura with Figma Make and Claude Code; drive much of the team's product analytics and first connected Pendo to Claude Code over MCP.</w:t>
+        <w:t xml:space="preserve">Pioneered AI prototyping at Encoura with Figma Make and Claude Code; drive much of the team's product analytics using Claude Code with the Pendo MCP.</w:t>
       </w:r>
       <w:r>
         <w:rPr>
@@ -367,7 +367,7 @@
           <w:bCs w:val="0"/>
           <w:rtl w:val="0"/>
         </w:rPr>
-        <w:t xml:space="preserve">Rebuilt student onboarding and accounts from classroom research; doubled the intake survey yet held completion near 84% in Encoura's first in-app A/B test.</w:t>
+        <w:t xml:space="preserve">Rebuilt student onboarding and accounts from classroom research; doubled the student data we collect yet held completion near 84% in Encoura's first in-app A/B test.</w:t>
       </w:r>
       <w:r>
         <w:rPr>
@@ -429,7 +429,7 @@
           <w:bCs w:val="0"/>
           <w:rtl w:val="0"/>
         </w:rPr>
-        <w:t xml:space="preserve">Own the Encourage Design System; re-architected its governance so engineers and designers compose from consistent components with no case-by-case review.</w:t>
+        <w:t xml:space="preserve">Own the Encourage Design System; re-architected its governance so engineers and designers compose from consistent components.</w:t>
       </w:r>
       <w:r>
         <w:rPr>

</xml_diff>

<commit_message>
Playlab résumé: link to rahulshah.design/playlab, contact line centered
The site link in the header now shows and points at the Playlab page, so
the hiring team lands on the version made for them. The contact line was
left-aligned with a fixed indent; it is now centered under the name.

Co-Authored-By: Claude Opus 5.5 <noreply@anthropic.com>
Claude-Session: https://claude.ai/code/session_01LvZ3gHBdktRdPitHGw6W9i
</commit_message>
<xml_diff>
--- a/playlab/resume.docx
+++ b/playlab/resume.docx
@@ -39,8 +39,8 @@
       <w:pPr>
         <w:pageBreakBefore w:val="0"/>
         <w:spacing w:after="0" w:before="0" w:line="240" w:lineRule="auto"/>
-        <w:ind w:left="2430" w:firstLine="0"/>
-        <w:jc w:val="left"/>
+        <w:ind w:left="0" w:firstLine="0"/>
+        <w:jc w:val="center"/>
         <w:rPr>
           <w:rFonts w:ascii="Arial" w:cs="Arial" w:eastAsia="Arial" w:hAnsi="Arial"/>
           <w:sz w:val="22"/>
@@ -55,7 +55,7 @@
             <w:u w:val="single"/>
             <w:rtl w:val="0"/>
           </w:rPr>
-          <w:t xml:space="preserve">rahulshah.design</w:t>
+          <w:t xml:space="preserve">rahulshah.design/playlab</w:t>
         </w:r>
       </w:hyperlink>
       <w:r>

</xml_diff>